<commit_message>
[Log] 2026.7.3 - 2026.7.11
</commit_message>
<xml_diff>
--- a/desktop_files/2026.docx
+++ b/desktop_files/2026.docx
@@ -3,21 +3,11 @@
 <w:document xmlns:wpc="http://schemas.microsoft.com/office/word/2010/wordprocessingCanvas" xmlns:cx="http://schemas.microsoft.com/office/drawing/2014/chartex" xmlns:cx1="http://schemas.microsoft.com/office/drawing/2015/9/8/chartex" xmlns:cx2="http://schemas.microsoft.com/office/drawing/2015/10/21/chartex" xmlns:cx3="http://schemas.microsoft.com/office/drawing/2016/5/9/chartex" xmlns:cx4="http://schemas.microsoft.com/office/drawing/2016/5/10/chartex" xmlns:cx5="http://schemas.microsoft.com/office/drawing/2016/5/11/chartex" xmlns:cx6="http://schemas.microsoft.com/office/drawing/2016/5/12/chartex" xmlns:cx7="http://schemas.microsoft.com/office/drawing/2016/5/13/chartex" xmlns:cx8="http://schemas.microsoft.com/office/drawing/2016/5/14/chartex" xmlns:mc="http://schemas.openxmlformats.org/markup-compatibility/2006" xmlns:aink="http://schemas.microsoft.com/office/drawing/2016/ink" xmlns:am3d="http://schemas.microsoft.com/office/drawing/2017/model3d" xmlns:o="urn:schemas-microsoft-com:office:office" xmlns:oel="http://schemas.microsoft.com/office/2019/extlst" xmlns:r="http://schemas.openxmlformats.org/officeDocument/2006/relationships" xmlns:m="http://schemas.openxmlformats.org/officeDocument/2006/math" xmlns:v="urn:schemas-microsoft-com:vml" xmlns:wp14="http://schemas.microsoft.com/office/word/2010/wordprocessingDrawing" xmlns:wp="http://schemas.openxmlformats.org/drawingml/2006/wordprocessingDrawing" xmlns:w10="urn:schemas-microsoft-com:office:word" xmlns:w="http://schemas.openxmlformats.org/wordprocessingml/2006/main" xmlns:w14="http://schemas.microsoft.com/office/word/2010/wordml" xmlns:w15="http://schemas.microsoft.com/office/word/2012/wordml" xmlns:w16cex="http://schemas.microsoft.com/office/word/2018/wordml/cex" xmlns:w16cid="http://schemas.microsoft.com/office/word/2016/wordml/cid" xmlns:w16="http://schemas.microsoft.com/office/word/2018/wordml" xmlns:w16du="http://schemas.microsoft.com/office/word/2023/wordml/word16du" xmlns:w16sdtdh="http://schemas.microsoft.com/office/word/2020/wordml/sdtdatahash" xmlns:w16sdtfl="http://schemas.microsoft.com/office/word/2024/wordml/sdtformatlock" xmlns:w16se="http://schemas.microsoft.com/office/word/2015/wordml/symex" xmlns:wpg="http://schemas.microsoft.com/office/word/2010/wordprocessingGroup" xmlns:wpi="http://schemas.microsoft.com/office/word/2010/wordprocessingInk" xmlns:wne="http://schemas.microsoft.com/office/word/2006/wordml" xmlns:wps="http://schemas.microsoft.com/office/word/2010/wordprocessingShape" mc:Ignorable="w14 w15 w16se w16cid w16 w16cex w16sdtdh w16sdtfl w16du wp14">
   <w:body>
     <w:p>
-      <w:pPr>
-        <w:rPr>
-          <w:rFonts w:hint="eastAsia"/>
-        </w:rPr>
-      </w:pPr>
       <w:r>
         <w:t>2026.1.6</w:t>
       </w:r>
     </w:p>
     <w:p>
-      <w:pPr>
-        <w:rPr>
-          <w:rFonts w:hint="eastAsia"/>
-        </w:rPr>
-      </w:pPr>
       <w:proofErr w:type="spellStart"/>
       <w:r>
         <w:t>Bishe</w:t>
@@ -33,19 +23,8 @@
         <w:t>chapter1&amp;2</w:t>
       </w:r>
     </w:p>
-    <w:p>
-      <w:pPr>
-        <w:rPr>
-          <w:rFonts w:hint="eastAsia"/>
-        </w:rPr>
-      </w:pPr>
-    </w:p>
-    <w:p>
-      <w:pPr>
-        <w:rPr>
-          <w:rFonts w:hint="eastAsia"/>
-        </w:rPr>
-      </w:pPr>
+    <w:p/>
+    <w:p>
       <w:r>
         <w:t>2026.1.</w:t>
       </w:r>
@@ -57,11 +36,6 @@
       </w:r>
     </w:p>
     <w:p>
-      <w:pPr>
-        <w:rPr>
-          <w:rFonts w:hint="eastAsia"/>
-        </w:rPr>
-      </w:pPr>
       <w:proofErr w:type="spellStart"/>
       <w:r>
         <w:t>Bishe</w:t>
@@ -92,19 +66,8 @@
         <w:t>1.2</w:t>
       </w:r>
     </w:p>
-    <w:p>
-      <w:pPr>
-        <w:rPr>
-          <w:rFonts w:hint="eastAsia"/>
-        </w:rPr>
-      </w:pPr>
-    </w:p>
-    <w:p>
-      <w:pPr>
-        <w:rPr>
-          <w:rFonts w:hint="eastAsia"/>
-        </w:rPr>
-      </w:pPr>
+    <w:p/>
+    <w:p>
       <w:r>
         <w:rPr>
           <w:rFonts w:hint="eastAsia"/>
@@ -113,11 +76,6 @@
       </w:r>
     </w:p>
     <w:p>
-      <w:pPr>
-        <w:rPr>
-          <w:rFonts w:hint="eastAsia"/>
-        </w:rPr>
-      </w:pPr>
       <w:proofErr w:type="spellStart"/>
       <w:r>
         <w:rPr>
@@ -135,19 +93,8 @@
         <w:t>——chapter2.1</w:t>
       </w:r>
     </w:p>
-    <w:p>
-      <w:pPr>
-        <w:rPr>
-          <w:rFonts w:hint="eastAsia"/>
-        </w:rPr>
-      </w:pPr>
-    </w:p>
-    <w:p>
-      <w:pPr>
-        <w:rPr>
-          <w:rFonts w:hint="eastAsia"/>
-        </w:rPr>
-      </w:pPr>
+    <w:p/>
+    <w:p>
       <w:r>
         <w:rPr>
           <w:rFonts w:hint="eastAsia"/>
@@ -156,11 +103,6 @@
       </w:r>
     </w:p>
     <w:p>
-      <w:pPr>
-        <w:rPr>
-          <w:rFonts w:hint="eastAsia"/>
-        </w:rPr>
-      </w:pPr>
       <w:proofErr w:type="spellStart"/>
       <w:r>
         <w:rPr>
@@ -176,19 +118,8 @@
         <w:t>——chapter2&amp;chapter3</w:t>
       </w:r>
     </w:p>
-    <w:p>
-      <w:pPr>
-        <w:rPr>
-          <w:rFonts w:hint="eastAsia"/>
-        </w:rPr>
-      </w:pPr>
-    </w:p>
-    <w:p>
-      <w:pPr>
-        <w:rPr>
-          <w:rFonts w:hint="eastAsia"/>
-        </w:rPr>
-      </w:pPr>
+    <w:p/>
+    <w:p>
       <w:r>
         <w:rPr>
           <w:rFonts w:hint="eastAsia"/>
@@ -197,11 +128,6 @@
       </w:r>
     </w:p>
     <w:p>
-      <w:pPr>
-        <w:rPr>
-          <w:rFonts w:hint="eastAsia"/>
-        </w:rPr>
-      </w:pPr>
       <w:proofErr w:type="spellStart"/>
       <w:r>
         <w:rPr>
@@ -230,19 +156,8 @@
         <w:t>&amp;chapter2.3</w:t>
       </w:r>
     </w:p>
-    <w:p>
-      <w:pPr>
-        <w:rPr>
-          <w:rFonts w:hint="eastAsia"/>
-        </w:rPr>
-      </w:pPr>
-    </w:p>
-    <w:p>
-      <w:pPr>
-        <w:rPr>
-          <w:rFonts w:hint="eastAsia"/>
-        </w:rPr>
-      </w:pPr>
+    <w:p/>
+    <w:p>
       <w:r>
         <w:rPr>
           <w:rFonts w:hint="eastAsia"/>
@@ -251,11 +166,6 @@
       </w:r>
     </w:p>
     <w:p>
-      <w:pPr>
-        <w:rPr>
-          <w:rFonts w:hint="eastAsia"/>
-        </w:rPr>
-      </w:pPr>
       <w:proofErr w:type="spellStart"/>
       <w:r>
         <w:rPr>
@@ -273,19 +183,8 @@
         <w:t>——chapter2.3 &amp; 2.4</w:t>
       </w:r>
     </w:p>
-    <w:p>
-      <w:pPr>
-        <w:rPr>
-          <w:rFonts w:hint="eastAsia"/>
-        </w:rPr>
-      </w:pPr>
-    </w:p>
-    <w:p>
-      <w:pPr>
-        <w:rPr>
-          <w:rFonts w:hint="eastAsia"/>
-        </w:rPr>
-      </w:pPr>
+    <w:p/>
+    <w:p>
       <w:r>
         <w:rPr>
           <w:rFonts w:hint="eastAsia"/>
@@ -294,11 +193,6 @@
       </w:r>
     </w:p>
     <w:p>
-      <w:pPr>
-        <w:rPr>
-          <w:rFonts w:hint="eastAsia"/>
-        </w:rPr>
-      </w:pPr>
       <w:proofErr w:type="spellStart"/>
       <w:r>
         <w:rPr>
@@ -325,19 +219,8 @@
       </w:r>
       <w:proofErr w:type="spellEnd"/>
     </w:p>
-    <w:p>
-      <w:pPr>
-        <w:rPr>
-          <w:rFonts w:hint="eastAsia"/>
-        </w:rPr>
-      </w:pPr>
-    </w:p>
-    <w:p>
-      <w:pPr>
-        <w:rPr>
-          <w:rFonts w:hint="eastAsia"/>
-        </w:rPr>
-      </w:pPr>
+    <w:p/>
+    <w:p>
       <w:r>
         <w:rPr>
           <w:rFonts w:hint="eastAsia"/>
@@ -346,11 +229,6 @@
       </w:r>
     </w:p>
     <w:p>
-      <w:pPr>
-        <w:rPr>
-          <w:rFonts w:hint="eastAsia"/>
-        </w:rPr>
-      </w:pPr>
       <w:proofErr w:type="spellStart"/>
       <w:r>
         <w:rPr>
@@ -369,11 +247,6 @@
       </w:r>
     </w:p>
     <w:p>
-      <w:pPr>
-        <w:rPr>
-          <w:rFonts w:hint="eastAsia"/>
-        </w:rPr>
-      </w:pPr>
       <w:proofErr w:type="spellStart"/>
       <w:r>
         <w:rPr>
@@ -403,19 +276,8 @@
         <w:t xml:space="preserve"> progress</w:t>
       </w:r>
     </w:p>
-    <w:p>
-      <w:pPr>
-        <w:rPr>
-          <w:rFonts w:hint="eastAsia"/>
-        </w:rPr>
-      </w:pPr>
-    </w:p>
-    <w:p>
-      <w:pPr>
-        <w:rPr>
-          <w:rFonts w:hint="eastAsia"/>
-        </w:rPr>
-      </w:pPr>
+    <w:p/>
+    <w:p>
       <w:r>
         <w:rPr>
           <w:rFonts w:hint="eastAsia"/>
@@ -424,11 +286,6 @@
       </w:r>
     </w:p>
     <w:p>
-      <w:pPr>
-        <w:rPr>
-          <w:rFonts w:hint="eastAsia"/>
-        </w:rPr>
-      </w:pPr>
       <w:proofErr w:type="spellStart"/>
       <w:r>
         <w:rPr>
@@ -480,19 +337,8 @@
         <w:t xml:space="preserve"> progress</w:t>
       </w:r>
     </w:p>
-    <w:p>
-      <w:pPr>
-        <w:rPr>
-          <w:rFonts w:hint="eastAsia"/>
-        </w:rPr>
-      </w:pPr>
-    </w:p>
-    <w:p>
-      <w:pPr>
-        <w:rPr>
-          <w:rFonts w:hint="eastAsia"/>
-        </w:rPr>
-      </w:pPr>
+    <w:p/>
+    <w:p>
       <w:r>
         <w:rPr>
           <w:rFonts w:hint="eastAsia"/>
@@ -501,11 +347,6 @@
       </w:r>
     </w:p>
     <w:p>
-      <w:pPr>
-        <w:rPr>
-          <w:rFonts w:hint="eastAsia"/>
-        </w:rPr>
-      </w:pPr>
       <w:r>
         <w:rPr>
           <w:rFonts w:hint="eastAsia"/>
@@ -514,11 +355,6 @@
       </w:r>
     </w:p>
     <w:p>
-      <w:pPr>
-        <w:rPr>
-          <w:rFonts w:hint="eastAsia"/>
-        </w:rPr>
-      </w:pPr>
       <w:proofErr w:type="spellStart"/>
       <w:r>
         <w:rPr>
@@ -556,19 +392,8 @@
         <w:t xml:space="preserve"> &amp; chapter3</w:t>
       </w:r>
     </w:p>
-    <w:p>
-      <w:pPr>
-        <w:rPr>
-          <w:rFonts w:hint="eastAsia"/>
-        </w:rPr>
-      </w:pPr>
-    </w:p>
-    <w:p>
-      <w:pPr>
-        <w:rPr>
-          <w:rFonts w:hint="eastAsia"/>
-        </w:rPr>
-      </w:pPr>
+    <w:p/>
+    <w:p>
       <w:r>
         <w:rPr>
           <w:rFonts w:hint="eastAsia"/>
@@ -583,11 +408,6 @@
       </w:r>
     </w:p>
     <w:p>
-      <w:pPr>
-        <w:rPr>
-          <w:rFonts w:hint="eastAsia"/>
-        </w:rPr>
-      </w:pPr>
       <w:r>
         <w:rPr>
           <w:rFonts w:hint="eastAsia"/>
@@ -596,11 +416,6 @@
       </w:r>
     </w:p>
     <w:p>
-      <w:pPr>
-        <w:rPr>
-          <w:rFonts w:hint="eastAsia"/>
-        </w:rPr>
-      </w:pPr>
       <w:proofErr w:type="spellStart"/>
       <w:r>
         <w:rPr>
@@ -616,19 +431,8 @@
         <w:t>——baking &amp; chapter3</w:t>
       </w:r>
     </w:p>
-    <w:p>
-      <w:pPr>
-        <w:rPr>
-          <w:rFonts w:hint="eastAsia"/>
-        </w:rPr>
-      </w:pPr>
-    </w:p>
-    <w:p>
-      <w:pPr>
-        <w:rPr>
-          <w:rFonts w:hint="eastAsia"/>
-        </w:rPr>
-      </w:pPr>
+    <w:p/>
+    <w:p>
       <w:r>
         <w:rPr>
           <w:rFonts w:hint="eastAsia"/>
@@ -643,11 +447,6 @@
       </w:r>
     </w:p>
     <w:p>
-      <w:pPr>
-        <w:rPr>
-          <w:rFonts w:hint="eastAsia"/>
-        </w:rPr>
-      </w:pPr>
       <w:r>
         <w:rPr>
           <w:rFonts w:hint="eastAsia"/>
@@ -656,11 +455,6 @@
       </w:r>
     </w:p>
     <w:p>
-      <w:pPr>
-        <w:rPr>
-          <w:rFonts w:hint="eastAsia"/>
-        </w:rPr>
-      </w:pPr>
       <w:proofErr w:type="spellStart"/>
       <w:r>
         <w:rPr>
@@ -676,26 +470,9 @@
         <w:t>——chapter3 &amp; chapter4</w:t>
       </w:r>
     </w:p>
-    <w:p>
-      <w:pPr>
-        <w:rPr>
-          <w:rFonts w:hint="eastAsia"/>
-        </w:rPr>
-      </w:pPr>
-    </w:p>
-    <w:p>
-      <w:pPr>
-        <w:rPr>
-          <w:rFonts w:hint="eastAsia"/>
-        </w:rPr>
-      </w:pPr>
-    </w:p>
-    <w:p>
-      <w:pPr>
-        <w:rPr>
-          <w:rFonts w:hint="eastAsia"/>
-        </w:rPr>
-      </w:pPr>
+    <w:p/>
+    <w:p/>
+    <w:p>
       <w:r>
         <w:rPr>
           <w:rFonts w:hint="eastAsia"/>
@@ -710,11 +487,6 @@
       </w:r>
     </w:p>
     <w:p>
-      <w:pPr>
-        <w:rPr>
-          <w:rFonts w:hint="eastAsia"/>
-        </w:rPr>
-      </w:pPr>
       <w:r>
         <w:rPr>
           <w:rFonts w:hint="eastAsia"/>
@@ -724,11 +496,6 @@
       </w:r>
     </w:p>
     <w:p>
-      <w:pPr>
-        <w:rPr>
-          <w:rFonts w:hint="eastAsia"/>
-        </w:rPr>
-      </w:pPr>
       <w:proofErr w:type="spellStart"/>
       <w:r>
         <w:rPr>
@@ -745,11 +512,6 @@
       </w:r>
     </w:p>
     <w:p>
-      <w:pPr>
-        <w:rPr>
-          <w:rFonts w:hint="eastAsia"/>
-        </w:rPr>
-      </w:pPr>
       <w:r>
         <w:rPr>
           <w:rFonts w:hint="eastAsia"/>
@@ -765,11 +527,6 @@
       </w:r>
     </w:p>
     <w:p>
-      <w:pPr>
-        <w:rPr>
-          <w:rFonts w:hint="eastAsia"/>
-        </w:rPr>
-      </w:pPr>
       <w:proofErr w:type="spellStart"/>
       <w:r>
         <w:rPr>
@@ -785,19 +542,8 @@
         <w:t>——chapter3 &amp; chapter4</w:t>
       </w:r>
     </w:p>
-    <w:p>
-      <w:pPr>
-        <w:rPr>
-          <w:rFonts w:hint="eastAsia"/>
-        </w:rPr>
-      </w:pPr>
-    </w:p>
-    <w:p>
-      <w:pPr>
-        <w:rPr>
-          <w:rFonts w:hint="eastAsia"/>
-        </w:rPr>
-      </w:pPr>
+    <w:p/>
+    <w:p>
       <w:r>
         <w:rPr>
           <w:rFonts w:hint="eastAsia"/>
@@ -806,11 +552,6 @@
       </w:r>
     </w:p>
     <w:p>
-      <w:pPr>
-        <w:rPr>
-          <w:rFonts w:hint="eastAsia"/>
-        </w:rPr>
-      </w:pPr>
       <w:proofErr w:type="spellStart"/>
       <w:r>
         <w:rPr>
@@ -826,19 +567,8 @@
         <w:t>——chapter3.3</w:t>
       </w:r>
     </w:p>
-    <w:p>
-      <w:pPr>
-        <w:rPr>
-          <w:rFonts w:hint="eastAsia"/>
-        </w:rPr>
-      </w:pPr>
-    </w:p>
-    <w:p>
-      <w:pPr>
-        <w:rPr>
-          <w:rFonts w:hint="eastAsia"/>
-        </w:rPr>
-      </w:pPr>
+    <w:p/>
+    <w:p>
       <w:r>
         <w:rPr>
           <w:rFonts w:hint="eastAsia"/>
@@ -847,11 +577,6 @@
       </w:r>
     </w:p>
     <w:p>
-      <w:pPr>
-        <w:rPr>
-          <w:rFonts w:hint="eastAsia"/>
-        </w:rPr>
-      </w:pPr>
       <w:proofErr w:type="spellStart"/>
       <w:r>
         <w:rPr>
@@ -869,19 +594,8 @@
         <w:t>——chapter4.3.3</w:t>
       </w:r>
     </w:p>
-    <w:p>
-      <w:pPr>
-        <w:rPr>
-          <w:rFonts w:hint="eastAsia"/>
-        </w:rPr>
-      </w:pPr>
-    </w:p>
-    <w:p>
-      <w:pPr>
-        <w:rPr>
-          <w:rFonts w:hint="eastAsia"/>
-        </w:rPr>
-      </w:pPr>
+    <w:p/>
+    <w:p>
       <w:r>
         <w:rPr>
           <w:rFonts w:hint="eastAsia"/>
@@ -890,11 +604,6 @@
       </w:r>
     </w:p>
     <w:p>
-      <w:pPr>
-        <w:rPr>
-          <w:rFonts w:hint="eastAsia"/>
-        </w:rPr>
-      </w:pPr>
       <w:proofErr w:type="spellStart"/>
       <w:r>
         <w:rPr>
@@ -912,19 +621,8 @@
         <w:t>——relighting ablation</w:t>
       </w:r>
     </w:p>
-    <w:p>
-      <w:pPr>
-        <w:rPr>
-          <w:rFonts w:hint="eastAsia"/>
-        </w:rPr>
-      </w:pPr>
-    </w:p>
-    <w:p>
-      <w:pPr>
-        <w:rPr>
-          <w:rFonts w:hint="eastAsia"/>
-        </w:rPr>
-      </w:pPr>
+    <w:p/>
+    <w:p>
       <w:r>
         <w:rPr>
           <w:rFonts w:hint="eastAsia"/>
@@ -933,11 +631,6 @@
       </w:r>
     </w:p>
     <w:p>
-      <w:pPr>
-        <w:rPr>
-          <w:rFonts w:hint="eastAsia"/>
-        </w:rPr>
-      </w:pPr>
       <w:proofErr w:type="spellStart"/>
       <w:r>
         <w:rPr>
@@ -953,19 +646,8 @@
         <w:t>——chapter4.2</w:t>
       </w:r>
     </w:p>
-    <w:p>
-      <w:pPr>
-        <w:rPr>
-          <w:rFonts w:hint="eastAsia"/>
-        </w:rPr>
-      </w:pPr>
-    </w:p>
-    <w:p>
-      <w:pPr>
-        <w:rPr>
-          <w:rFonts w:hint="eastAsia"/>
-        </w:rPr>
-      </w:pPr>
+    <w:p/>
+    <w:p>
       <w:r>
         <w:rPr>
           <w:rFonts w:hint="eastAsia"/>
@@ -974,11 +656,6 @@
       </w:r>
     </w:p>
     <w:p>
-      <w:pPr>
-        <w:rPr>
-          <w:rFonts w:hint="eastAsia"/>
-        </w:rPr>
-      </w:pPr>
       <w:proofErr w:type="spellStart"/>
       <w:r>
         <w:rPr>
@@ -994,19 +671,8 @@
         <w:t>——chapter4.2</w:t>
       </w:r>
     </w:p>
-    <w:p>
-      <w:pPr>
-        <w:rPr>
-          <w:rFonts w:hint="eastAsia"/>
-        </w:rPr>
-      </w:pPr>
-    </w:p>
-    <w:p>
-      <w:pPr>
-        <w:rPr>
-          <w:rFonts w:hint="eastAsia"/>
-        </w:rPr>
-      </w:pPr>
+    <w:p/>
+    <w:p>
       <w:r>
         <w:rPr>
           <w:rFonts w:hint="eastAsia"/>
@@ -1015,11 +681,6 @@
       </w:r>
     </w:p>
     <w:p>
-      <w:pPr>
-        <w:rPr>
-          <w:rFonts w:hint="eastAsia"/>
-        </w:rPr>
-      </w:pPr>
       <w:proofErr w:type="spellStart"/>
       <w:r>
         <w:rPr>
@@ -1035,19 +696,8 @@
         <w:t>——chapter3.2 &amp; chapter4.2</w:t>
       </w:r>
     </w:p>
-    <w:p>
-      <w:pPr>
-        <w:rPr>
-          <w:rFonts w:hint="eastAsia"/>
-        </w:rPr>
-      </w:pPr>
-    </w:p>
-    <w:p>
-      <w:pPr>
-        <w:rPr>
-          <w:rFonts w:hint="eastAsia"/>
-        </w:rPr>
-      </w:pPr>
+    <w:p/>
+    <w:p>
       <w:r>
         <w:rPr>
           <w:rFonts w:hint="eastAsia"/>
@@ -1056,11 +706,6 @@
       </w:r>
     </w:p>
     <w:p>
-      <w:pPr>
-        <w:rPr>
-          <w:rFonts w:hint="eastAsia"/>
-        </w:rPr>
-      </w:pPr>
       <w:proofErr w:type="spellStart"/>
       <w:r>
         <w:rPr>
@@ -1076,19 +721,8 @@
         <w:t>——chapter3.2 &amp; chapter4.2</w:t>
       </w:r>
     </w:p>
-    <w:p>
-      <w:pPr>
-        <w:rPr>
-          <w:rFonts w:hint="eastAsia"/>
-        </w:rPr>
-      </w:pPr>
-    </w:p>
-    <w:p>
-      <w:pPr>
-        <w:rPr>
-          <w:rFonts w:hint="eastAsia"/>
-        </w:rPr>
-      </w:pPr>
+    <w:p/>
+    <w:p>
       <w:r>
         <w:rPr>
           <w:rFonts w:hint="eastAsia"/>
@@ -1097,11 +731,6 @@
       </w:r>
     </w:p>
     <w:p>
-      <w:pPr>
-        <w:rPr>
-          <w:rFonts w:hint="eastAsia"/>
-        </w:rPr>
-      </w:pPr>
       <w:proofErr w:type="spellStart"/>
       <w:r>
         <w:rPr>
@@ -1137,19 +766,8 @@
         <w:t>chapter4.2</w:t>
       </w:r>
     </w:p>
-    <w:p>
-      <w:pPr>
-        <w:rPr>
-          <w:rFonts w:hint="eastAsia"/>
-        </w:rPr>
-      </w:pPr>
-    </w:p>
-    <w:p>
-      <w:pPr>
-        <w:rPr>
-          <w:rFonts w:hint="eastAsia"/>
-        </w:rPr>
-      </w:pPr>
+    <w:p/>
+    <w:p>
       <w:r>
         <w:rPr>
           <w:rFonts w:hint="eastAsia"/>
@@ -1158,11 +776,6 @@
       </w:r>
     </w:p>
     <w:p>
-      <w:pPr>
-        <w:rPr>
-          <w:rFonts w:hint="eastAsia"/>
-        </w:rPr>
-      </w:pPr>
       <w:proofErr w:type="spellStart"/>
       <w:r>
         <w:rPr>
@@ -1180,19 +793,8 @@
         <w:t>——RRGS相关所有</w:t>
       </w:r>
     </w:p>
-    <w:p>
-      <w:pPr>
-        <w:rPr>
-          <w:rFonts w:hint="eastAsia"/>
-        </w:rPr>
-      </w:pPr>
-    </w:p>
-    <w:p>
-      <w:pPr>
-        <w:rPr>
-          <w:rFonts w:hint="eastAsia"/>
-        </w:rPr>
-      </w:pPr>
+    <w:p/>
+    <w:p>
       <w:r>
         <w:rPr>
           <w:rFonts w:hint="eastAsia"/>
@@ -1201,11 +803,6 @@
       </w:r>
     </w:p>
     <w:p>
-      <w:pPr>
-        <w:rPr>
-          <w:rFonts w:hint="eastAsia"/>
-        </w:rPr>
-      </w:pPr>
       <w:proofErr w:type="spellStart"/>
       <w:r>
         <w:rPr>
@@ -1237,19 +834,8 @@
         <w:t>相关所有</w:t>
       </w:r>
     </w:p>
-    <w:p>
-      <w:pPr>
-        <w:rPr>
-          <w:rFonts w:hint="eastAsia"/>
-        </w:rPr>
-      </w:pPr>
-    </w:p>
-    <w:p>
-      <w:pPr>
-        <w:rPr>
-          <w:rFonts w:hint="eastAsia"/>
-        </w:rPr>
-      </w:pPr>
+    <w:p/>
+    <w:p>
       <w:r>
         <w:rPr>
           <w:rFonts w:hint="eastAsia"/>
@@ -1258,11 +844,6 @@
       </w:r>
     </w:p>
     <w:p>
-      <w:pPr>
-        <w:rPr>
-          <w:rFonts w:hint="eastAsia"/>
-        </w:rPr>
-      </w:pPr>
       <w:proofErr w:type="spellStart"/>
       <w:r>
         <w:rPr>
@@ -1294,19 +875,8 @@
         <w:t>相关所有</w:t>
       </w:r>
     </w:p>
-    <w:p>
-      <w:pPr>
-        <w:rPr>
-          <w:rFonts w:hint="eastAsia"/>
-        </w:rPr>
-      </w:pPr>
-    </w:p>
-    <w:p>
-      <w:pPr>
-        <w:rPr>
-          <w:rFonts w:hint="eastAsia"/>
-        </w:rPr>
-      </w:pPr>
+    <w:p/>
+    <w:p>
       <w:r>
         <w:rPr>
           <w:rFonts w:hint="eastAsia"/>
@@ -1315,11 +885,6 @@
       </w:r>
     </w:p>
     <w:p>
-      <w:pPr>
-        <w:rPr>
-          <w:rFonts w:hint="eastAsia"/>
-        </w:rPr>
-      </w:pPr>
       <w:proofErr w:type="spellStart"/>
       <w:r>
         <w:rPr>
@@ -1335,19 +900,8 @@
         <w:t>——chapter3 &amp; chapter4文字</w:t>
       </w:r>
     </w:p>
-    <w:p>
-      <w:pPr>
-        <w:rPr>
-          <w:rFonts w:hint="eastAsia"/>
-        </w:rPr>
-      </w:pPr>
-    </w:p>
-    <w:p>
-      <w:pPr>
-        <w:rPr>
-          <w:rFonts w:hint="eastAsia"/>
-        </w:rPr>
-      </w:pPr>
+    <w:p/>
+    <w:p>
       <w:r>
         <w:rPr>
           <w:rFonts w:hint="eastAsia"/>
@@ -1362,11 +916,6 @@
       </w:r>
     </w:p>
     <w:p>
-      <w:pPr>
-        <w:rPr>
-          <w:rFonts w:hint="eastAsia"/>
-        </w:rPr>
-      </w:pPr>
       <w:proofErr w:type="spellStart"/>
       <w:r>
         <w:rPr>
@@ -1395,19 +944,8 @@
         <w:t xml:space="preserve"> &amp; chapter4文字</w:t>
       </w:r>
     </w:p>
-    <w:p>
-      <w:pPr>
-        <w:rPr>
-          <w:rFonts w:hint="eastAsia"/>
-        </w:rPr>
-      </w:pPr>
-    </w:p>
-    <w:p>
-      <w:pPr>
-        <w:rPr>
-          <w:rFonts w:hint="eastAsia"/>
-        </w:rPr>
-      </w:pPr>
+    <w:p/>
+    <w:p>
       <w:r>
         <w:rPr>
           <w:rFonts w:hint="eastAsia"/>
@@ -1416,11 +954,6 @@
       </w:r>
     </w:p>
     <w:p>
-      <w:pPr>
-        <w:rPr>
-          <w:rFonts w:hint="eastAsia"/>
-        </w:rPr>
-      </w:pPr>
       <w:proofErr w:type="spellStart"/>
       <w:r>
         <w:rPr>
@@ -1450,11 +983,6 @@
       </w:r>
     </w:p>
     <w:p>
-      <w:pPr>
-        <w:rPr>
-          <w:rFonts w:hint="eastAsia"/>
-        </w:rPr>
-      </w:pPr>
       <w:r>
         <w:rPr>
           <w:rFonts w:hint="eastAsia"/>
@@ -1464,528 +992,327 @@
       </w:r>
     </w:p>
     <w:p>
+      <w:proofErr w:type="spellStart"/>
+      <w:r>
+        <w:rPr>
+          <w:rFonts w:hint="eastAsia"/>
+        </w:rPr>
+        <w:t>Bishe</w:t>
+      </w:r>
+      <w:proofErr w:type="spellEnd"/>
+      <w:r>
+        <w:rPr>
+          <w:rFonts w:hint="eastAsia"/>
+        </w:rPr>
+        <w:t>——</w:t>
+      </w:r>
+      <w:r>
+        <w:rPr>
+          <w:rFonts w:hint="eastAsia"/>
+        </w:rPr>
+        <w:t xml:space="preserve">chapter1 </w:t>
+      </w:r>
+      <w:r>
+        <w:rPr>
+          <w:rFonts w:hint="eastAsia"/>
+          <w:highlight w:val="yellow"/>
+        </w:rPr>
+        <w:t xml:space="preserve">&amp; </w:t>
+      </w:r>
+      <w:r>
+        <w:rPr>
+          <w:highlight w:val="yellow"/>
+        </w:rPr>
+        <w:t>chapter</w:t>
+      </w:r>
+      <w:r>
+        <w:rPr>
+          <w:rFonts w:hint="eastAsia"/>
+          <w:highlight w:val="yellow"/>
+        </w:rPr>
+        <w:t>2</w:t>
+      </w:r>
+    </w:p>
+    <w:p/>
+    <w:p>
+      <w:r>
+        <w:rPr>
+          <w:rFonts w:hint="eastAsia"/>
+        </w:rPr>
+        <w:t>2026.2.3.5</w:t>
+      </w:r>
+    </w:p>
+    <w:p>
+      <w:proofErr w:type="spellStart"/>
+      <w:r>
+        <w:rPr>
+          <w:rFonts w:hint="eastAsia"/>
+        </w:rPr>
+        <w:t>Bishe</w:t>
+      </w:r>
+      <w:proofErr w:type="spellEnd"/>
+      <w:r>
+        <w:rPr>
+          <w:rFonts w:hint="eastAsia"/>
+        </w:rPr>
+        <w:t>——version 1.0</w:t>
+      </w:r>
+    </w:p>
+    <w:p/>
+    <w:p>
+      <w:r>
+        <w:rPr>
+          <w:rFonts w:hint="eastAsia"/>
+        </w:rPr>
+        <w:t>2026.2.3.5</w:t>
+      </w:r>
+    </w:p>
+    <w:p>
+      <w:proofErr w:type="spellStart"/>
+      <w:r>
+        <w:rPr>
+          <w:rFonts w:hint="eastAsia"/>
+        </w:rPr>
+        <w:t>Bishe</w:t>
+      </w:r>
+      <w:proofErr w:type="spellEnd"/>
+      <w:r>
+        <w:rPr>
+          <w:rFonts w:hint="eastAsia"/>
+        </w:rPr>
+        <w:t>——</w:t>
+      </w:r>
+      <w:r>
+        <w:rPr>
+          <w:rFonts w:hint="eastAsia"/>
+          <w:highlight w:val="yellow"/>
+        </w:rPr>
+        <w:t>version 1.0</w:t>
+      </w:r>
+    </w:p>
+    <w:p/>
+    <w:p>
+      <w:r>
+        <w:t>2026.3.18</w:t>
+      </w:r>
+    </w:p>
+    <w:p>
+      <w:proofErr w:type="spellStart"/>
+      <w:r>
+        <w:rPr>
+          <w:highlight w:val="yellow"/>
+        </w:rPr>
+        <w:t>Bishe</w:t>
+      </w:r>
+      <w:proofErr w:type="spellEnd"/>
+      <w:r>
+        <w:rPr>
+          <w:rFonts w:hint="eastAsia"/>
+          <w:highlight w:val="yellow"/>
+        </w:rPr>
+        <w:t>——查重&amp;to word</w:t>
+      </w:r>
+    </w:p>
+    <w:p/>
+    <w:p>
+      <w:r>
+        <w:t>2026.4.19</w:t>
+      </w:r>
+    </w:p>
+    <w:p>
+      <w:r>
+        <w:t>Xiao</w:t>
+      </w:r>
+      <w:r>
+        <w:rPr>
+          <w:rFonts w:hint="eastAsia"/>
+        </w:rPr>
+        <w:t>——</w:t>
+      </w:r>
+      <w:r>
+        <w:t>introduction</w:t>
+      </w:r>
+    </w:p>
+    <w:p/>
+    <w:p>
+      <w:r>
+        <w:t>2026.4.25</w:t>
+      </w:r>
+    </w:p>
+    <w:p>
+      <w:r>
+        <w:t>Ai video</w:t>
+      </w:r>
+    </w:p>
+    <w:p>
+      <w:r>
+        <w:t>Xiao</w:t>
+      </w:r>
+      <w:r>
+        <w:rPr>
+          <w:rFonts w:hint="eastAsia"/>
+        </w:rPr>
+        <w:t>——</w:t>
+      </w:r>
+      <w:r>
+        <w:t>all</w:t>
+      </w:r>
+    </w:p>
+    <w:p/>
+    <w:p>
+      <w:r>
+        <w:t>2026.4.29</w:t>
+      </w:r>
+    </w:p>
+    <w:p>
+      <w:r>
+        <w:rPr>
+          <w:highlight w:val="yellow"/>
+        </w:rPr>
+        <w:t>Cc deployment</w:t>
+      </w:r>
+    </w:p>
+    <w:p>
+      <w:r>
+        <w:t>Ai video half</w:t>
+      </w:r>
+    </w:p>
+    <w:p>
+      <w:proofErr w:type="spellStart"/>
+      <w:r>
+        <w:rPr>
+          <w:highlight w:val="yellow"/>
+        </w:rPr>
+        <w:t>Triblend</w:t>
+      </w:r>
+      <w:proofErr w:type="spellEnd"/>
+      <w:r>
+        <w:rPr>
+          <w:highlight w:val="yellow"/>
+        </w:rPr>
+        <w:t xml:space="preserve"> terrain v1</w:t>
+      </w:r>
+    </w:p>
+    <w:p/>
+    <w:p>
+      <w:r>
+        <w:t>2026.5.1</w:t>
+      </w:r>
+    </w:p>
+    <w:p>
+      <w:r>
+        <w:rPr>
+          <w:highlight w:val="yellow"/>
+        </w:rPr>
+        <w:t>Xiao</w:t>
+      </w:r>
+      <w:r>
+        <w:rPr>
+          <w:rFonts w:hint="eastAsia"/>
+          <w:highlight w:val="yellow"/>
+        </w:rPr>
+        <w:t>——all</w:t>
+      </w:r>
+    </w:p>
+    <w:p/>
+    <w:p>
+      <w:r>
+        <w:t>2026.5.10</w:t>
+      </w:r>
+    </w:p>
+    <w:p>
+      <w:r>
+        <w:rPr>
+          <w:highlight w:val="yellow"/>
+        </w:rPr>
+        <w:t>Claw</w:t>
+      </w:r>
+    </w:p>
+    <w:p>
+      <w:r>
+        <w:rPr>
+          <w:highlight w:val="yellow"/>
+        </w:rPr>
+        <w:t>Ai video half</w:t>
+      </w:r>
+    </w:p>
+    <w:p>
+      <w:r>
+        <w:t xml:space="preserve">Team Analysis </w:t>
+      </w:r>
+    </w:p>
+    <w:p/>
+    <w:p>
+      <w:r>
+        <w:t>2026.5.17</w:t>
+      </w:r>
+    </w:p>
+    <w:p>
+      <w:r>
+        <w:t>Ai video all</w:t>
+      </w:r>
+    </w:p>
+    <w:p>
       <w:pPr>
         <w:rPr>
-          <w:rFonts w:hint="eastAsia"/>
+          <w:highlight w:val="yellow"/>
         </w:rPr>
       </w:pPr>
       <w:proofErr w:type="spellStart"/>
       <w:r>
         <w:rPr>
-          <w:rFonts w:hint="eastAsia"/>
-        </w:rPr>
-        <w:t>Bishe</w:t>
-      </w:r>
-      <w:proofErr w:type="spellEnd"/>
-      <w:r>
-        <w:rPr>
-          <w:rFonts w:hint="eastAsia"/>
-        </w:rPr>
-        <w:t>——</w:t>
-      </w:r>
-      <w:r>
-        <w:rPr>
-          <w:rFonts w:hint="eastAsia"/>
-        </w:rPr>
-        <w:t xml:space="preserve">chapter1 </w:t>
-      </w:r>
-      <w:r>
-        <w:rPr>
-          <w:rFonts w:hint="eastAsia"/>
-          <w:highlight w:val="yellow"/>
-        </w:rPr>
-        <w:t xml:space="preserve">&amp; </w:t>
-      </w:r>
-      <w:r>
-        <w:rPr>
-          <w:highlight w:val="yellow"/>
-        </w:rPr>
-        <w:t>chapter</w:t>
-      </w:r>
-      <w:r>
-        <w:rPr>
-          <w:rFonts w:hint="eastAsia"/>
-          <w:highlight w:val="yellow"/>
-        </w:rPr>
-        <w:t>2</w:t>
-      </w:r>
-    </w:p>
-    <w:p>
-      <w:pPr>
-        <w:rPr>
-          <w:rFonts w:hint="eastAsia"/>
-        </w:rPr>
-      </w:pPr>
-    </w:p>
-    <w:p>
-      <w:pPr>
-        <w:rPr>
-          <w:rFonts w:hint="eastAsia"/>
-        </w:rPr>
-      </w:pPr>
-      <w:r>
-        <w:rPr>
-          <w:rFonts w:hint="eastAsia"/>
-        </w:rPr>
-        <w:t>2026.2.3.5</w:t>
-      </w:r>
-    </w:p>
-    <w:p>
-      <w:pPr>
-        <w:rPr>
-          <w:rFonts w:hint="eastAsia"/>
-        </w:rPr>
-      </w:pPr>
-      <w:proofErr w:type="spellStart"/>
-      <w:r>
-        <w:rPr>
-          <w:rFonts w:hint="eastAsia"/>
-        </w:rPr>
-        <w:t>Bishe</w:t>
-      </w:r>
-      <w:proofErr w:type="spellEnd"/>
-      <w:r>
-        <w:rPr>
-          <w:rFonts w:hint="eastAsia"/>
-        </w:rPr>
-        <w:t>——version 1.0</w:t>
-      </w:r>
-    </w:p>
-    <w:p>
-      <w:pPr>
-        <w:rPr>
-          <w:rFonts w:hint="eastAsia"/>
-        </w:rPr>
-      </w:pPr>
-    </w:p>
-    <w:p>
-      <w:pPr>
-        <w:rPr>
-          <w:rFonts w:hint="eastAsia"/>
-        </w:rPr>
-      </w:pPr>
-      <w:r>
-        <w:rPr>
-          <w:rFonts w:hint="eastAsia"/>
-        </w:rPr>
-        <w:t>2026.2.3.5</w:t>
-      </w:r>
-    </w:p>
-    <w:p>
-      <w:pPr>
-        <w:rPr>
-          <w:rFonts w:hint="eastAsia"/>
-        </w:rPr>
-      </w:pPr>
-      <w:proofErr w:type="spellStart"/>
-      <w:r>
-        <w:rPr>
-          <w:rFonts w:hint="eastAsia"/>
-        </w:rPr>
-        <w:t>Bishe</w:t>
-      </w:r>
-      <w:proofErr w:type="spellEnd"/>
-      <w:r>
-        <w:rPr>
-          <w:rFonts w:hint="eastAsia"/>
-        </w:rPr>
-        <w:t>——</w:t>
-      </w:r>
-      <w:r>
-        <w:rPr>
-          <w:rFonts w:hint="eastAsia"/>
-          <w:highlight w:val="yellow"/>
-        </w:rPr>
-        <w:t>version 1.0</w:t>
-      </w:r>
-    </w:p>
-    <w:p>
-      <w:pPr>
-        <w:rPr>
-          <w:rFonts w:hint="eastAsia"/>
-        </w:rPr>
-      </w:pPr>
-    </w:p>
-    <w:p>
-      <w:pPr>
-        <w:rPr>
-          <w:rFonts w:hint="eastAsia"/>
-        </w:rPr>
-      </w:pPr>
-      <w:r>
-        <w:t>2026.3.18</w:t>
-      </w:r>
-    </w:p>
-    <w:p>
-      <w:pPr>
-        <w:rPr>
-          <w:rFonts w:hint="eastAsia"/>
-        </w:rPr>
-      </w:pPr>
-      <w:proofErr w:type="spellStart"/>
-      <w:r>
-        <w:rPr>
-          <w:highlight w:val="yellow"/>
-        </w:rPr>
-        <w:t>Bishe</w:t>
-      </w:r>
-      <w:proofErr w:type="spellEnd"/>
-      <w:r>
-        <w:rPr>
-          <w:rFonts w:hint="eastAsia"/>
-          <w:highlight w:val="yellow"/>
-        </w:rPr>
-        <w:t>——查重&amp;to word</w:t>
-      </w:r>
-    </w:p>
-    <w:p>
-      <w:pPr>
-        <w:rPr>
-          <w:rFonts w:hint="eastAsia"/>
-        </w:rPr>
-      </w:pPr>
-    </w:p>
-    <w:p>
-      <w:pPr>
-        <w:rPr>
-          <w:rFonts w:hint="eastAsia"/>
-        </w:rPr>
-      </w:pPr>
-      <w:r>
-        <w:t>2026.4.19</w:t>
-      </w:r>
-    </w:p>
-    <w:p>
-      <w:pPr>
-        <w:rPr>
-          <w:rFonts w:hint="eastAsia"/>
-        </w:rPr>
-      </w:pPr>
-      <w:r>
-        <w:t>Xiao</w:t>
-      </w:r>
-      <w:r>
-        <w:rPr>
-          <w:rFonts w:hint="eastAsia"/>
-        </w:rPr>
-        <w:t>——</w:t>
-      </w:r>
-      <w:r>
-        <w:t>introduction</w:t>
-      </w:r>
-    </w:p>
-    <w:p>
-      <w:pPr>
-        <w:rPr>
-          <w:rFonts w:hint="eastAsia"/>
-        </w:rPr>
-      </w:pPr>
-    </w:p>
-    <w:p>
-      <w:pPr>
-        <w:rPr>
-          <w:rFonts w:hint="eastAsia"/>
-        </w:rPr>
-      </w:pPr>
-      <w:r>
-        <w:t>2026.4.25</w:t>
-      </w:r>
-    </w:p>
-    <w:p>
-      <w:pPr>
-        <w:rPr>
-          <w:rFonts w:hint="eastAsia"/>
-        </w:rPr>
-      </w:pPr>
-      <w:r>
-        <w:t>Ai video</w:t>
-      </w:r>
-    </w:p>
-    <w:p>
-      <w:pPr>
-        <w:rPr>
-          <w:rFonts w:hint="eastAsia"/>
-        </w:rPr>
-      </w:pPr>
-      <w:r>
-        <w:t>Xiao</w:t>
-      </w:r>
-      <w:r>
-        <w:rPr>
-          <w:rFonts w:hint="eastAsia"/>
-        </w:rPr>
-        <w:t>——</w:t>
-      </w:r>
-      <w:r>
-        <w:t>all</w:t>
-      </w:r>
-    </w:p>
-    <w:p>
-      <w:pPr>
-        <w:rPr>
-          <w:rFonts w:hint="eastAsia"/>
-        </w:rPr>
-      </w:pPr>
-    </w:p>
-    <w:p>
-      <w:pPr>
-        <w:rPr>
-          <w:rFonts w:hint="eastAsia"/>
-        </w:rPr>
-      </w:pPr>
-      <w:r>
-        <w:t>2026.4.29</w:t>
-      </w:r>
-    </w:p>
-    <w:p>
-      <w:pPr>
-        <w:rPr>
-          <w:rFonts w:hint="eastAsia"/>
-        </w:rPr>
-      </w:pPr>
-      <w:r>
-        <w:rPr>
-          <w:highlight w:val="yellow"/>
-        </w:rPr>
-        <w:t>Cc deployment</w:t>
-      </w:r>
-    </w:p>
-    <w:p>
-      <w:pPr>
-        <w:rPr>
-          <w:rFonts w:hint="eastAsia"/>
-        </w:rPr>
-      </w:pPr>
-      <w:r>
-        <w:t>Ai video half</w:t>
-      </w:r>
-    </w:p>
-    <w:p>
-      <w:pPr>
-        <w:rPr>
-          <w:rFonts w:hint="eastAsia"/>
-        </w:rPr>
-      </w:pPr>
-      <w:proofErr w:type="spellStart"/>
-      <w:r>
-        <w:rPr>
-          <w:highlight w:val="yellow"/>
-        </w:rPr>
-        <w:t>Triblend</w:t>
-      </w:r>
-      <w:proofErr w:type="spellEnd"/>
-      <w:r>
-        <w:rPr>
-          <w:highlight w:val="yellow"/>
-        </w:rPr>
-        <w:t xml:space="preserve"> terrain v1</w:t>
-      </w:r>
-    </w:p>
-    <w:p>
-      <w:pPr>
-        <w:rPr>
-          <w:rFonts w:hint="eastAsia"/>
-        </w:rPr>
-      </w:pPr>
-    </w:p>
-    <w:p>
-      <w:pPr>
-        <w:rPr>
-          <w:rFonts w:hint="eastAsia"/>
-        </w:rPr>
-      </w:pPr>
-      <w:r>
-        <w:t>2026.5.1</w:t>
-      </w:r>
-    </w:p>
-    <w:p>
-      <w:pPr>
-        <w:rPr>
-          <w:rFonts w:hint="eastAsia"/>
-        </w:rPr>
-      </w:pPr>
-      <w:r>
-        <w:rPr>
-          <w:highlight w:val="yellow"/>
-        </w:rPr>
-        <w:t>Xiao</w:t>
-      </w:r>
-      <w:r>
-        <w:rPr>
-          <w:rFonts w:hint="eastAsia"/>
-          <w:highlight w:val="yellow"/>
-        </w:rPr>
-        <w:t>——all</w:t>
-      </w:r>
-    </w:p>
-    <w:p>
-      <w:pPr>
-        <w:rPr>
-          <w:rFonts w:hint="eastAsia"/>
-        </w:rPr>
-      </w:pPr>
-    </w:p>
-    <w:p>
-      <w:pPr>
-        <w:rPr>
-          <w:rFonts w:hint="eastAsia"/>
-        </w:rPr>
-      </w:pPr>
-      <w:r>
-        <w:t>2026.5.10</w:t>
-      </w:r>
-    </w:p>
-    <w:p>
-      <w:pPr>
-        <w:rPr>
-          <w:rFonts w:hint="eastAsia"/>
-        </w:rPr>
-      </w:pPr>
-      <w:r>
-        <w:rPr>
-          <w:highlight w:val="yellow"/>
-        </w:rPr>
-        <w:t>Claw</w:t>
-      </w:r>
-    </w:p>
-    <w:p>
-      <w:pPr>
-        <w:rPr>
-          <w:rFonts w:hint="eastAsia"/>
-        </w:rPr>
-      </w:pPr>
-      <w:r>
-        <w:rPr>
-          <w:highlight w:val="yellow"/>
-        </w:rPr>
-        <w:t>Ai video half</w:t>
-      </w:r>
-    </w:p>
-    <w:p>
-      <w:pPr>
-        <w:rPr>
-          <w:rFonts w:hint="eastAsia"/>
-        </w:rPr>
-      </w:pPr>
-      <w:r>
-        <w:t xml:space="preserve">Team Analysis </w:t>
-      </w:r>
-    </w:p>
-    <w:p>
-      <w:pPr>
-        <w:rPr>
-          <w:rFonts w:hint="eastAsia"/>
-        </w:rPr>
-      </w:pPr>
-    </w:p>
-    <w:p>
-      <w:pPr>
-        <w:rPr>
-          <w:rFonts w:hint="eastAsia"/>
-        </w:rPr>
-      </w:pPr>
-      <w:r>
-        <w:t>2026.5.17</w:t>
-      </w:r>
-    </w:p>
-    <w:p>
-      <w:pPr>
-        <w:rPr>
-          <w:rFonts w:hint="eastAsia"/>
-        </w:rPr>
-      </w:pPr>
-      <w:r>
+          <w:highlight w:val="yellow"/>
+        </w:rPr>
+        <w:t>Bishe</w:t>
+      </w:r>
+      <w:proofErr w:type="spellEnd"/>
+      <w:r>
+        <w:rPr>
+          <w:highlight w:val="yellow"/>
+        </w:rPr>
+        <w:t xml:space="preserve"> </w:t>
+      </w:r>
+      <w:r>
+        <w:rPr>
+          <w:rFonts w:hint="eastAsia"/>
+          <w:highlight w:val="yellow"/>
+        </w:rPr>
+        <w:t>改</w:t>
+      </w:r>
+    </w:p>
+    <w:p>
+      <w:proofErr w:type="spellStart"/>
+      <w:r>
+        <w:rPr>
+          <w:rFonts w:hint="eastAsia"/>
+          <w:highlight w:val="yellow"/>
+        </w:rPr>
+        <w:t>Bishe</w:t>
+      </w:r>
+      <w:proofErr w:type="spellEnd"/>
+      <w:r>
+        <w:rPr>
+          <w:rFonts w:hint="eastAsia"/>
+          <w:highlight w:val="yellow"/>
+        </w:rPr>
+        <w:t xml:space="preserve"> PPT</w:t>
+      </w:r>
+    </w:p>
+    <w:p/>
+    <w:p>
+      <w:r>
+        <w:t>2026.5.24</w:t>
+      </w:r>
+    </w:p>
+    <w:p>
+      <w:r>
+        <w:rPr>
+          <w:highlight w:val="yellow"/>
+        </w:rPr>
         <w:t>Ai video all</w:t>
       </w:r>
     </w:p>
     <w:p>
-      <w:pPr>
-        <w:rPr>
-          <w:rFonts w:hint="eastAsia"/>
-          <w:highlight w:val="yellow"/>
-        </w:rPr>
-      </w:pPr>
-      <w:proofErr w:type="spellStart"/>
-      <w:r>
-        <w:rPr>
-          <w:highlight w:val="yellow"/>
-        </w:rPr>
-        <w:t>Bishe</w:t>
-      </w:r>
-      <w:proofErr w:type="spellEnd"/>
-      <w:r>
-        <w:rPr>
-          <w:highlight w:val="yellow"/>
-        </w:rPr>
-        <w:t xml:space="preserve"> </w:t>
-      </w:r>
-      <w:r>
-        <w:rPr>
-          <w:rFonts w:hint="eastAsia"/>
-          <w:highlight w:val="yellow"/>
-        </w:rPr>
-        <w:t>改</w:t>
-      </w:r>
-    </w:p>
-    <w:p>
-      <w:pPr>
-        <w:rPr>
-          <w:rFonts w:hint="eastAsia"/>
-        </w:rPr>
-      </w:pPr>
-      <w:proofErr w:type="spellStart"/>
-      <w:r>
-        <w:rPr>
-          <w:rFonts w:hint="eastAsia"/>
-          <w:highlight w:val="yellow"/>
-        </w:rPr>
-        <w:t>Bishe</w:t>
-      </w:r>
-      <w:proofErr w:type="spellEnd"/>
-      <w:r>
-        <w:rPr>
-          <w:rFonts w:hint="eastAsia"/>
-          <w:highlight w:val="yellow"/>
-        </w:rPr>
-        <w:t xml:space="preserve"> PPT</w:t>
-      </w:r>
-    </w:p>
-    <w:p>
-      <w:pPr>
-        <w:rPr>
-          <w:rFonts w:hint="eastAsia"/>
-        </w:rPr>
-      </w:pPr>
-    </w:p>
-    <w:p>
-      <w:pPr>
-        <w:rPr>
-          <w:rFonts w:hint="eastAsia"/>
-        </w:rPr>
-      </w:pPr>
-      <w:r>
-        <w:t>2026.5.24</w:t>
-      </w:r>
-    </w:p>
-    <w:p>
-      <w:pPr>
-        <w:rPr>
-          <w:rFonts w:hint="eastAsia"/>
-        </w:rPr>
-      </w:pPr>
-      <w:r>
-        <w:rPr>
-          <w:highlight w:val="yellow"/>
-        </w:rPr>
-        <w:t>Ai video all</w:t>
-      </w:r>
-    </w:p>
-    <w:p>
-      <w:pPr>
-        <w:rPr>
-          <w:rFonts w:hint="eastAsia"/>
-        </w:rPr>
-      </w:pPr>
       <w:r>
         <w:rPr>
           <w:rFonts w:hint="eastAsia"/>
@@ -2000,29 +1327,13 @@
         <w:t>归档</w:t>
       </w:r>
     </w:p>
-    <w:p>
-      <w:pPr>
-        <w:rPr>
-          <w:rFonts w:hint="eastAsia"/>
-        </w:rPr>
-      </w:pPr>
-    </w:p>
-    <w:p>
-      <w:pPr>
-        <w:rPr>
-          <w:rFonts w:hint="eastAsia"/>
-        </w:rPr>
-      </w:pPr>
+    <w:p/>
+    <w:p>
       <w:r>
         <w:t>2026.5.25</w:t>
       </w:r>
     </w:p>
     <w:p>
-      <w:pPr>
-        <w:rPr>
-          <w:rFonts w:hint="eastAsia"/>
-        </w:rPr>
-      </w:pPr>
       <w:r>
         <w:rPr>
           <w:rFonts w:hint="eastAsia"/>
@@ -2032,21 +1343,11 @@
       </w:r>
     </w:p>
     <w:p>
-      <w:pPr>
-        <w:rPr>
-          <w:rFonts w:hint="eastAsia"/>
-        </w:rPr>
-      </w:pPr>
       <w:r>
         <w:t>Cod terrain</w:t>
       </w:r>
     </w:p>
     <w:p>
-      <w:pPr>
-        <w:rPr>
-          <w:rFonts w:hint="eastAsia"/>
-        </w:rPr>
-      </w:pPr>
       <w:r>
         <w:rPr>
           <w:rFonts w:hint="eastAsia"/>
@@ -2056,86 +1357,105 @@
       </w:r>
     </w:p>
     <w:p>
+      <w:r>
+        <w:rPr>
+          <w:rFonts w:hint="eastAsia"/>
+        </w:rPr>
+        <w:t>Tech：GI文章</w:t>
+      </w:r>
+    </w:p>
+    <w:p>
+      <w:r>
+        <w:rPr>
+          <w:rFonts w:hint="eastAsia"/>
+        </w:rPr>
+        <w:t>Product：调研</w:t>
+      </w:r>
+    </w:p>
+    <w:p/>
+    <w:p>
+      <w:r>
+        <w:rPr>
+          <w:rFonts w:hint="eastAsia"/>
+        </w:rPr>
+        <w:t>2026.6.30</w:t>
+      </w:r>
+    </w:p>
+    <w:p>
+      <w:r>
+        <w:rPr>
+          <w:rFonts w:hint="eastAsia"/>
+          <w:highlight w:val="yellow"/>
+        </w:rPr>
+        <w:t>Tech：</w:t>
+      </w:r>
+      <w:r>
+        <w:rPr>
+          <w:rFonts w:hint="eastAsia"/>
+          <w:highlight w:val="yellow"/>
+        </w:rPr>
+        <w:t xml:space="preserve">Ghost of </w:t>
+      </w:r>
+      <w:proofErr w:type="spellStart"/>
+      <w:r>
+        <w:rPr>
+          <w:rFonts w:hint="eastAsia"/>
+          <w:highlight w:val="yellow"/>
+        </w:rPr>
+        <w:t>Yotei</w:t>
+      </w:r>
+      <w:proofErr w:type="spellEnd"/>
+    </w:p>
+    <w:p>
+      <w:r>
+        <w:rPr>
+          <w:rFonts w:hint="eastAsia"/>
+        </w:rPr>
+        <w:t>Pika：CMAKE</w:t>
+      </w:r>
+    </w:p>
+    <w:p/>
+    <w:p>
       <w:pPr>
         <w:rPr>
           <w:rFonts w:hint="eastAsia"/>
         </w:rPr>
       </w:pPr>
       <w:r>
-        <w:rPr>
-          <w:rFonts w:hint="eastAsia"/>
-        </w:rPr>
-        <w:t>Tech：GI文章</w:t>
-      </w:r>
-    </w:p>
-    <w:p>
-      <w:pPr>
-        <w:rPr>
-          <w:rFonts w:hint="eastAsia"/>
-        </w:rPr>
-      </w:pPr>
-      <w:r>
-        <w:rPr>
-          <w:rFonts w:hint="eastAsia"/>
-        </w:rPr>
-        <w:t>Product：调研</w:t>
-      </w:r>
-    </w:p>
-    <w:p>
-      <w:pPr>
-        <w:rPr>
-          <w:rFonts w:hint="eastAsia"/>
-        </w:rPr>
-      </w:pPr>
-    </w:p>
-    <w:p>
-      <w:pPr>
-        <w:rPr>
-          <w:rFonts w:hint="eastAsia"/>
-        </w:rPr>
-      </w:pPr>
-      <w:r>
-        <w:rPr>
-          <w:rFonts w:hint="eastAsia"/>
-        </w:rPr>
-        <w:t>2026.6.</w:t>
-      </w:r>
-      <w:r>
-        <w:rPr>
-          <w:rFonts w:hint="eastAsia"/>
-        </w:rPr>
-        <w:t>30</w:t>
-      </w:r>
-    </w:p>
-    <w:p>
-      <w:pPr>
-        <w:rPr>
-          <w:rFonts w:hint="eastAsia"/>
-        </w:rPr>
-      </w:pPr>
-      <w:r>
-        <w:rPr>
-          <w:rFonts w:hint="eastAsia"/>
-          <w:highlight w:val="yellow"/>
-        </w:rPr>
-        <w:t>Tech：</w:t>
-      </w:r>
-      <w:r>
-        <w:rPr>
-          <w:rFonts w:hint="eastAsia"/>
-          <w:highlight w:val="yellow"/>
-        </w:rPr>
-        <w:t xml:space="preserve">Ghost of </w:t>
-      </w:r>
-      <w:proofErr w:type="spellStart"/>
-      <w:r>
-        <w:rPr>
-          <w:rFonts w:hint="eastAsia"/>
-          <w:highlight w:val="yellow"/>
-        </w:rPr>
-        <w:t>Yotei</w:t>
-      </w:r>
-      <w:proofErr w:type="spellEnd"/>
+        <w:t>2026.7.3</w:t>
+      </w:r>
+      <w:r>
+        <w:rPr>
+          <w:rFonts w:hint="eastAsia"/>
+        </w:rPr>
+        <w:t xml:space="preserve"> </w:t>
+      </w:r>
+      <w:r>
+        <w:t>–</w:t>
+      </w:r>
+      <w:r>
+        <w:rPr>
+          <w:rFonts w:hint="eastAsia"/>
+        </w:rPr>
+        <w:t xml:space="preserve"> </w:t>
+      </w:r>
+      <w:r>
+        <w:rPr>
+          <w:rFonts w:hint="eastAsia"/>
+        </w:rPr>
+        <w:t>2026.7.11</w:t>
+      </w:r>
+    </w:p>
+    <w:p>
+      <w:r>
+        <w:t>GI</w:t>
+      </w:r>
+      <w:r>
+        <w:rPr>
+          <w:rFonts w:hint="eastAsia"/>
+        </w:rPr>
+        <w:t>初稿</w:t>
+      </w:r>
     </w:p>
     <w:p>
       <w:pPr>
@@ -2164,11 +1484,6 @@
 <w:endnotes xmlns:wpc="http://schemas.microsoft.com/office/word/2010/wordprocessingCanvas" xmlns:cx="http://schemas.microsoft.com/office/drawing/2014/chartex" xmlns:cx1="http://schemas.microsoft.com/office/drawing/2015/9/8/chartex" xmlns:cx2="http://schemas.microsoft.com/office/drawing/2015/10/21/chartex" xmlns:cx3="http://schemas.microsoft.com/office/drawing/2016/5/9/chartex" xmlns:cx4="http://schemas.microsoft.com/office/drawing/2016/5/10/chartex" xmlns:cx5="http://schemas.microsoft.com/office/drawing/2016/5/11/chartex" xmlns:cx6="http://schemas.microsoft.com/office/drawing/2016/5/12/chartex" xmlns:cx7="http://schemas.microsoft.com/office/drawing/2016/5/13/chartex" xmlns:cx8="http://schemas.microsoft.com/office/drawing/2016/5/14/chartex" xmlns:mc="http://schemas.openxmlformats.org/markup-compatibility/2006" xmlns:aink="http://schemas.microsoft.com/office/drawing/2016/ink" xmlns:am3d="http://schemas.microsoft.com/office/drawing/2017/model3d" xmlns:o="urn:schemas-microsoft-com:office:office" xmlns:oel="http://schemas.microsoft.com/office/2019/extlst" xmlns:r="http://schemas.openxmlformats.org/officeDocument/2006/relationships" xmlns:m="http://schemas.openxmlformats.org/officeDocument/2006/math" xmlns:v="urn:schemas-microsoft-com:vml" xmlns:wp14="http://schemas.microsoft.com/office/word/2010/wordprocessingDrawing" xmlns:wp="http://schemas.openxmlformats.org/drawingml/2006/wordprocessingDrawing" xmlns:w10="urn:schemas-microsoft-com:office:word" xmlns:w="http://schemas.openxmlformats.org/wordprocessingml/2006/main" xmlns:w14="http://schemas.microsoft.com/office/word/2010/wordml" xmlns:w15="http://schemas.microsoft.com/office/word/2012/wordml" xmlns:w16cex="http://schemas.microsoft.com/office/word/2018/wordml/cex" xmlns:w16cid="http://schemas.microsoft.com/office/word/2016/wordml/cid" xmlns:w16="http://schemas.microsoft.com/office/word/2018/wordml" xmlns:w16du="http://schemas.microsoft.com/office/word/2023/wordml/word16du" xmlns:w16sdtdh="http://schemas.microsoft.com/office/word/2020/wordml/sdtdatahash" xmlns:w16sdtfl="http://schemas.microsoft.com/office/word/2024/wordml/sdtformatlock" xmlns:w16se="http://schemas.microsoft.com/office/word/2015/wordml/symex" xmlns:wpg="http://schemas.microsoft.com/office/word/2010/wordprocessingGroup" xmlns:wpi="http://schemas.microsoft.com/office/word/2010/wordprocessingInk" xmlns:wne="http://schemas.microsoft.com/office/word/2006/wordml" xmlns:wps="http://schemas.microsoft.com/office/word/2010/wordprocessingShape" mc:Ignorable="w14 w15 w16se w16cid w16 w16cex w16sdtdh w16sdtfl w16du wp14">
   <w:endnote w:type="separator" w:id="-1">
     <w:p>
-      <w:pPr>
-        <w:rPr>
-          <w:rFonts w:hint="eastAsia"/>
-        </w:rPr>
-      </w:pPr>
       <w:r>
         <w:separator/>
       </w:r>
@@ -2176,11 +1491,6 @@
   </w:endnote>
   <w:endnote w:type="continuationSeparator" w:id="0">
     <w:p>
-      <w:pPr>
-        <w:rPr>
-          <w:rFonts w:hint="eastAsia"/>
-        </w:rPr>
-      </w:pPr>
       <w:r>
         <w:continuationSeparator/>
       </w:r>
@@ -2193,11 +1503,6 @@
 <w:footnotes xmlns:wpc="http://schemas.microsoft.com/office/word/2010/wordprocessingCanvas" xmlns:cx="http://schemas.microsoft.com/office/drawing/2014/chartex" xmlns:cx1="http://schemas.microsoft.com/office/drawing/2015/9/8/chartex" xmlns:cx2="http://schemas.microsoft.com/office/drawing/2015/10/21/chartex" xmlns:cx3="http://schemas.microsoft.com/office/drawing/2016/5/9/chartex" xmlns:cx4="http://schemas.microsoft.com/office/drawing/2016/5/10/chartex" xmlns:cx5="http://schemas.microsoft.com/office/drawing/2016/5/11/chartex" xmlns:cx6="http://schemas.microsoft.com/office/drawing/2016/5/12/chartex" xmlns:cx7="http://schemas.microsoft.com/office/drawing/2016/5/13/chartex" xmlns:cx8="http://schemas.microsoft.com/office/drawing/2016/5/14/chartex" xmlns:mc="http://schemas.openxmlformats.org/markup-compatibility/2006" xmlns:aink="http://schemas.microsoft.com/office/drawing/2016/ink" xmlns:am3d="http://schemas.microsoft.com/office/drawing/2017/model3d" xmlns:o="urn:schemas-microsoft-com:office:office" xmlns:oel="http://schemas.microsoft.com/office/2019/extlst" xmlns:r="http://schemas.openxmlformats.org/officeDocument/2006/relationships" xmlns:m="http://schemas.openxmlformats.org/officeDocument/2006/math" xmlns:v="urn:schemas-microsoft-com:vml" xmlns:wp14="http://schemas.microsoft.com/office/word/2010/wordprocessingDrawing" xmlns:wp="http://schemas.openxmlformats.org/drawingml/2006/wordprocessingDrawing" xmlns:w10="urn:schemas-microsoft-com:office:word" xmlns:w="http://schemas.openxmlformats.org/wordprocessingml/2006/main" xmlns:w14="http://schemas.microsoft.com/office/word/2010/wordml" xmlns:w15="http://schemas.microsoft.com/office/word/2012/wordml" xmlns:w16cex="http://schemas.microsoft.com/office/word/2018/wordml/cex" xmlns:w16cid="http://schemas.microsoft.com/office/word/2016/wordml/cid" xmlns:w16="http://schemas.microsoft.com/office/word/2018/wordml" xmlns:w16du="http://schemas.microsoft.com/office/word/2023/wordml/word16du" xmlns:w16sdtdh="http://schemas.microsoft.com/office/word/2020/wordml/sdtdatahash" xmlns:w16sdtfl="http://schemas.microsoft.com/office/word/2024/wordml/sdtformatlock" xmlns:w16se="http://schemas.microsoft.com/office/word/2015/wordml/symex" xmlns:wpg="http://schemas.microsoft.com/office/word/2010/wordprocessingGroup" xmlns:wpi="http://schemas.microsoft.com/office/word/2010/wordprocessingInk" xmlns:wne="http://schemas.microsoft.com/office/word/2006/wordml" xmlns:wps="http://schemas.microsoft.com/office/word/2010/wordprocessingShape" mc:Ignorable="w14 w15 w16se w16cid w16 w16cex w16sdtdh w16sdtfl w16du wp14">
   <w:footnote w:type="separator" w:id="-1">
     <w:p>
-      <w:pPr>
-        <w:rPr>
-          <w:rFonts w:hint="eastAsia"/>
-        </w:rPr>
-      </w:pPr>
       <w:r>
         <w:separator/>
       </w:r>
@@ -2205,11 +1510,6 @@
   </w:footnote>
   <w:footnote w:type="continuationSeparator" w:id="0">
     <w:p>
-      <w:pPr>
-        <w:rPr>
-          <w:rFonts w:hint="eastAsia"/>
-        </w:rPr>
-      </w:pPr>
       <w:r>
         <w:continuationSeparator/>
       </w:r>
@@ -2610,7 +1910,7 @@
     <w:lsdException w:name="Unresolved Mention" w:semiHidden="1" w:unhideWhenUsed="1"/>
     <w:lsdException w:name="Smart Link" w:semiHidden="1" w:unhideWhenUsed="1"/>
   </w:latentStyles>
-  <w:style w:type="paragraph" w:default="1" w:styleId="a">
+  <w:style w:type="paragraph" w:default="1" w:styleId="Normal">
     <w:name w:val="Normal"/>
     <w:qFormat/>
     <w:rsid w:val="00E62D9A"/>
@@ -2619,13 +1919,13 @@
       <w:jc w:val="both"/>
     </w:pPr>
   </w:style>
-  <w:style w:type="character" w:default="1" w:styleId="a0">
+  <w:style w:type="character" w:default="1" w:styleId="DefaultParagraphFont">
     <w:name w:val="Default Paragraph Font"/>
     <w:uiPriority w:val="1"/>
     <w:semiHidden/>
     <w:unhideWhenUsed/>
   </w:style>
-  <w:style w:type="table" w:default="1" w:styleId="a1">
+  <w:style w:type="table" w:default="1" w:styleId="TableNormal">
     <w:name w:val="Normal Table"/>
     <w:uiPriority w:val="99"/>
     <w:semiHidden/>
@@ -2640,17 +1940,17 @@
       </w:tblCellMar>
     </w:tblPr>
   </w:style>
-  <w:style w:type="numbering" w:default="1" w:styleId="a2">
+  <w:style w:type="numbering" w:default="1" w:styleId="NoList">
     <w:name w:val="No List"/>
     <w:uiPriority w:val="99"/>
     <w:semiHidden/>
     <w:unhideWhenUsed/>
   </w:style>
-  <w:style w:type="paragraph" w:styleId="a3">
+  <w:style w:type="paragraph" w:styleId="Date">
     <w:name w:val="Date"/>
-    <w:basedOn w:val="a"/>
-    <w:next w:val="a"/>
-    <w:link w:val="a4"/>
+    <w:basedOn w:val="Normal"/>
+    <w:next w:val="Normal"/>
+    <w:link w:val="DateChar"/>
     <w:uiPriority w:val="99"/>
     <w:semiHidden/>
     <w:unhideWhenUsed/>
@@ -2659,18 +1959,18 @@
       <w:ind w:leftChars="2500" w:left="100"/>
     </w:pPr>
   </w:style>
-  <w:style w:type="character" w:customStyle="1" w:styleId="a4">
-    <w:name w:val="日期 字符"/>
-    <w:basedOn w:val="a0"/>
-    <w:link w:val="a3"/>
+  <w:style w:type="character" w:customStyle="1" w:styleId="DateChar">
+    <w:name w:val="Date Char"/>
+    <w:basedOn w:val="DefaultParagraphFont"/>
+    <w:link w:val="Date"/>
     <w:uiPriority w:val="99"/>
     <w:semiHidden/>
     <w:rsid w:val="00793C74"/>
   </w:style>
-  <w:style w:type="paragraph" w:styleId="a5">
+  <w:style w:type="paragraph" w:styleId="Header">
     <w:name w:val="header"/>
-    <w:basedOn w:val="a"/>
-    <w:link w:val="a6"/>
+    <w:basedOn w:val="Normal"/>
+    <w:link w:val="HeaderChar"/>
     <w:uiPriority w:val="99"/>
     <w:unhideWhenUsed/>
     <w:rsid w:val="00F75922"/>
@@ -2687,10 +1987,10 @@
       <w:szCs w:val="18"/>
     </w:rPr>
   </w:style>
-  <w:style w:type="character" w:customStyle="1" w:styleId="a6">
-    <w:name w:val="页眉 字符"/>
-    <w:basedOn w:val="a0"/>
-    <w:link w:val="a5"/>
+  <w:style w:type="character" w:customStyle="1" w:styleId="HeaderChar">
+    <w:name w:val="Header Char"/>
+    <w:basedOn w:val="DefaultParagraphFont"/>
+    <w:link w:val="Header"/>
     <w:uiPriority w:val="99"/>
     <w:rsid w:val="00F75922"/>
     <w:rPr>
@@ -2698,10 +1998,10 @@
       <w:szCs w:val="18"/>
     </w:rPr>
   </w:style>
-  <w:style w:type="paragraph" w:styleId="a7">
+  <w:style w:type="paragraph" w:styleId="Footer">
     <w:name w:val="footer"/>
-    <w:basedOn w:val="a"/>
-    <w:link w:val="a8"/>
+    <w:basedOn w:val="Normal"/>
+    <w:link w:val="FooterChar"/>
     <w:uiPriority w:val="99"/>
     <w:unhideWhenUsed/>
     <w:rsid w:val="00F75922"/>
@@ -2718,10 +2018,10 @@
       <w:szCs w:val="18"/>
     </w:rPr>
   </w:style>
-  <w:style w:type="character" w:customStyle="1" w:styleId="a8">
-    <w:name w:val="页脚 字符"/>
-    <w:basedOn w:val="a0"/>
-    <w:link w:val="a7"/>
+  <w:style w:type="character" w:customStyle="1" w:styleId="FooterChar">
+    <w:name w:val="Footer Char"/>
+    <w:basedOn w:val="DefaultParagraphFont"/>
+    <w:link w:val="Footer"/>
     <w:uiPriority w:val="99"/>
     <w:rsid w:val="00F75922"/>
     <w:rPr>

</xml_diff>